<commit_message>
Updated 2 files: Changelog- CHARMS.docx, Changelog- CHARMS.pdf
</commit_message>
<xml_diff>
--- a/Documents/Changelog- CHARMS.docx
+++ b/Documents/Changelog- CHARMS.docx
@@ -264,7 +264,13 @@
               <w:jc w:val="center"/>
             </w:pPr>
             <w:r>
-              <w:t>Result of latest upgrade.</w:t>
+              <w:t xml:space="preserve">Result of </w:t>
+            </w:r>
+            <w:r>
+              <w:t xml:space="preserve">the </w:t>
+            </w:r>
+            <w:r>
+              <w:t>latest upgrade.</w:t>
             </w:r>
           </w:p>
         </w:tc>
@@ -316,1005 +322,41 @@
               <w:t>Added the following as options on the new Sibling relationships dropdown on Child Main details:</w:t>
             </w:r>
           </w:p>
-          <w:tbl>
-            <w:tblPr>
-              <w:tblW w:w="4529" w:type="dxa"/>
-              <w:tblLook w:val="04A0" w:firstRow="1" w:lastRow="0" w:firstColumn="1" w:lastColumn="0" w:noHBand="0" w:noVBand="1"/>
-            </w:tblPr>
-            <w:tblGrid>
-              <w:gridCol w:w="1060"/>
-              <w:gridCol w:w="2409"/>
-              <w:gridCol w:w="1156"/>
-            </w:tblGrid>
-            <w:tr>
-              <w:trPr>
-                <w:trHeight w:val="312"/>
-              </w:trPr>
-              <w:tc>
-                <w:tcPr>
-                  <w:tcW w:w="1060" w:type="dxa"/>
-                  <w:tcBorders>
-                    <w:top w:val="nil"/>
-                    <w:left w:val="nil"/>
-                    <w:bottom w:val="nil"/>
-                    <w:right w:val="nil"/>
-                  </w:tcBorders>
-                  <w:noWrap/>
-                  <w:vAlign w:val="bottom"/>
-                  <w:hideMark/>
-                </w:tcPr>
-                <w:p>
-                  <w:pPr>
-                    <w:spacing w:after="0" w:line="240" w:lineRule="auto"/>
-                    <w:rPr>
-                      <w:rFonts w:ascii="Aptos Narrow" w:eastAsia="Times New Roman" w:hAnsi="Aptos Narrow" w:cs="Times New Roman"/>
-                      <w:kern w:val="0"/>
-                      <w:lang w:eastAsia="en-GB"/>
-                      <w14:ligatures w14:val="none"/>
-                    </w:rPr>
-                  </w:pPr>
-                  <w:r>
-                    <w:rPr>
-                      <w:rFonts w:ascii="Aptos Narrow" w:eastAsia="Times New Roman" w:hAnsi="Aptos Narrow" w:cs="Times New Roman"/>
-                      <w:kern w:val="0"/>
-                      <w:lang w:eastAsia="en-GB"/>
-                      <w14:ligatures w14:val="none"/>
-                    </w:rPr>
-                    <w:t>ID</w:t>
-                  </w:r>
-                </w:p>
-              </w:tc>
-              <w:tc>
-                <w:tcPr>
-                  <w:tcW w:w="2409" w:type="dxa"/>
-                  <w:tcBorders>
-                    <w:top w:val="nil"/>
-                    <w:left w:val="nil"/>
-                    <w:bottom w:val="nil"/>
-                    <w:right w:val="nil"/>
-                  </w:tcBorders>
-                  <w:noWrap/>
-                  <w:vAlign w:val="bottom"/>
-                  <w:hideMark/>
-                </w:tcPr>
-                <w:p>
-                  <w:pPr>
-                    <w:spacing w:after="0" w:line="240" w:lineRule="auto"/>
-                    <w:rPr>
-                      <w:rFonts w:ascii="Aptos Narrow" w:eastAsia="Times New Roman" w:hAnsi="Aptos Narrow" w:cs="Times New Roman"/>
-                      <w:kern w:val="0"/>
-                      <w:lang w:eastAsia="en-GB"/>
-                      <w14:ligatures w14:val="none"/>
-                    </w:rPr>
-                  </w:pPr>
-                  <w:proofErr w:type="spellStart"/>
-                  <w:r>
-                    <w:rPr>
-                      <w:rFonts w:ascii="Aptos Narrow" w:eastAsia="Times New Roman" w:hAnsi="Aptos Narrow" w:cs="Times New Roman"/>
-                      <w:kern w:val="0"/>
-                      <w:lang w:eastAsia="en-GB"/>
-                      <w14:ligatures w14:val="none"/>
-                    </w:rPr>
-                    <w:t>RelationshipType</w:t>
-                  </w:r>
-                  <w:proofErr w:type="spellEnd"/>
-                </w:p>
-              </w:tc>
-              <w:tc>
-                <w:tcPr>
-                  <w:tcW w:w="1060" w:type="dxa"/>
-                  <w:tcBorders>
-                    <w:top w:val="nil"/>
-                    <w:left w:val="nil"/>
-                    <w:bottom w:val="nil"/>
-                    <w:right w:val="nil"/>
-                  </w:tcBorders>
-                  <w:noWrap/>
-                  <w:vAlign w:val="bottom"/>
-                  <w:hideMark/>
-                </w:tcPr>
-                <w:p>
-                  <w:pPr>
-                    <w:spacing w:after="0" w:line="240" w:lineRule="auto"/>
-                    <w:rPr>
-                      <w:rFonts w:ascii="Aptos Narrow" w:eastAsia="Times New Roman" w:hAnsi="Aptos Narrow" w:cs="Times New Roman"/>
-                      <w:kern w:val="0"/>
-                      <w:lang w:eastAsia="en-GB"/>
-                      <w14:ligatures w14:val="none"/>
-                    </w:rPr>
-                  </w:pPr>
-                  <w:proofErr w:type="spellStart"/>
-                  <w:r>
-                    <w:rPr>
-                      <w:rFonts w:ascii="Aptos Narrow" w:eastAsia="Times New Roman" w:hAnsi="Aptos Narrow" w:cs="Times New Roman"/>
-                      <w:kern w:val="0"/>
-                      <w:lang w:eastAsia="en-GB"/>
-                      <w14:ligatures w14:val="none"/>
-                    </w:rPr>
-                    <w:t>SortOrder</w:t>
-                  </w:r>
-                  <w:proofErr w:type="spellEnd"/>
-                </w:p>
-              </w:tc>
-            </w:tr>
-            <w:tr>
-              <w:trPr>
-                <w:trHeight w:val="312"/>
-              </w:trPr>
-              <w:tc>
-                <w:tcPr>
-                  <w:tcW w:w="1060" w:type="dxa"/>
-                  <w:tcBorders>
-                    <w:top w:val="nil"/>
-                    <w:left w:val="nil"/>
-                    <w:bottom w:val="nil"/>
-                    <w:right w:val="nil"/>
-                  </w:tcBorders>
-                  <w:noWrap/>
-                  <w:vAlign w:val="bottom"/>
-                  <w:hideMark/>
-                </w:tcPr>
-                <w:p>
-                  <w:pPr>
-                    <w:spacing w:after="0" w:line="240" w:lineRule="auto"/>
-                    <w:jc w:val="right"/>
-                    <w:rPr>
-                      <w:rFonts w:ascii="Aptos Narrow" w:eastAsia="Times New Roman" w:hAnsi="Aptos Narrow" w:cs="Times New Roman"/>
-                      <w:kern w:val="0"/>
-                      <w:lang w:eastAsia="en-GB"/>
-                      <w14:ligatures w14:val="none"/>
-                    </w:rPr>
-                  </w:pPr>
-                  <w:r>
-                    <w:rPr>
-                      <w:rFonts w:ascii="Aptos Narrow" w:eastAsia="Times New Roman" w:hAnsi="Aptos Narrow" w:cs="Times New Roman"/>
-                      <w:kern w:val="0"/>
-                      <w:lang w:eastAsia="en-GB"/>
-                      <w14:ligatures w14:val="none"/>
-                    </w:rPr>
-                    <w:t>1</w:t>
-                  </w:r>
-                </w:p>
-              </w:tc>
-              <w:tc>
-                <w:tcPr>
-                  <w:tcW w:w="2409" w:type="dxa"/>
-                  <w:tcBorders>
-                    <w:top w:val="nil"/>
-                    <w:left w:val="nil"/>
-                    <w:bottom w:val="nil"/>
-                    <w:right w:val="nil"/>
-                  </w:tcBorders>
-                  <w:noWrap/>
-                  <w:vAlign w:val="bottom"/>
-                  <w:hideMark/>
-                </w:tcPr>
-                <w:p>
-                  <w:pPr>
-                    <w:spacing w:after="0" w:line="240" w:lineRule="auto"/>
-                    <w:rPr>
-                      <w:rFonts w:ascii="Aptos Narrow" w:eastAsia="Times New Roman" w:hAnsi="Aptos Narrow" w:cs="Times New Roman"/>
-                      <w:kern w:val="0"/>
-                      <w:lang w:eastAsia="en-GB"/>
-                      <w14:ligatures w14:val="none"/>
-                    </w:rPr>
-                  </w:pPr>
-                  <w:r>
-                    <w:rPr>
-                      <w:rFonts w:ascii="Aptos Narrow" w:eastAsia="Times New Roman" w:hAnsi="Aptos Narrow" w:cs="Times New Roman"/>
-                      <w:kern w:val="0"/>
-                      <w:lang w:eastAsia="en-GB"/>
-                      <w14:ligatures w14:val="none"/>
-                    </w:rPr>
-                    <w:t>Brother</w:t>
-                  </w:r>
-                </w:p>
-              </w:tc>
-              <w:tc>
-                <w:tcPr>
-                  <w:tcW w:w="1060" w:type="dxa"/>
-                  <w:tcBorders>
-                    <w:top w:val="nil"/>
-                    <w:left w:val="nil"/>
-                    <w:bottom w:val="nil"/>
-                    <w:right w:val="nil"/>
-                  </w:tcBorders>
-                  <w:noWrap/>
-                  <w:vAlign w:val="bottom"/>
-                  <w:hideMark/>
-                </w:tcPr>
-                <w:p>
-                  <w:pPr>
-                    <w:spacing w:after="0" w:line="240" w:lineRule="auto"/>
-                    <w:jc w:val="right"/>
-                    <w:rPr>
-                      <w:rFonts w:ascii="Aptos Narrow" w:eastAsia="Times New Roman" w:hAnsi="Aptos Narrow" w:cs="Times New Roman"/>
-                      <w:kern w:val="0"/>
-                      <w:lang w:eastAsia="en-GB"/>
-                      <w14:ligatures w14:val="none"/>
-                    </w:rPr>
-                  </w:pPr>
-                  <w:r>
-                    <w:rPr>
-                      <w:rFonts w:ascii="Aptos Narrow" w:eastAsia="Times New Roman" w:hAnsi="Aptos Narrow" w:cs="Times New Roman"/>
-                      <w:kern w:val="0"/>
-                      <w:lang w:eastAsia="en-GB"/>
-                      <w14:ligatures w14:val="none"/>
-                    </w:rPr>
-                    <w:t>1</w:t>
-                  </w:r>
-                </w:p>
-              </w:tc>
-            </w:tr>
-            <w:tr>
-              <w:trPr>
-                <w:trHeight w:val="312"/>
-              </w:trPr>
-              <w:tc>
-                <w:tcPr>
-                  <w:tcW w:w="1060" w:type="dxa"/>
-                  <w:tcBorders>
-                    <w:top w:val="nil"/>
-                    <w:left w:val="nil"/>
-                    <w:bottom w:val="nil"/>
-                    <w:right w:val="nil"/>
-                  </w:tcBorders>
-                  <w:noWrap/>
-                  <w:vAlign w:val="bottom"/>
-                  <w:hideMark/>
-                </w:tcPr>
-                <w:p>
-                  <w:pPr>
-                    <w:spacing w:after="0" w:line="240" w:lineRule="auto"/>
-                    <w:jc w:val="right"/>
-                    <w:rPr>
-                      <w:rFonts w:ascii="Aptos Narrow" w:eastAsia="Times New Roman" w:hAnsi="Aptos Narrow" w:cs="Times New Roman"/>
-                      <w:kern w:val="0"/>
-                      <w:lang w:eastAsia="en-GB"/>
-                      <w14:ligatures w14:val="none"/>
-                    </w:rPr>
-                  </w:pPr>
-                  <w:r>
-                    <w:rPr>
-                      <w:rFonts w:ascii="Aptos Narrow" w:eastAsia="Times New Roman" w:hAnsi="Aptos Narrow" w:cs="Times New Roman"/>
-                      <w:kern w:val="0"/>
-                      <w:lang w:eastAsia="en-GB"/>
-                      <w14:ligatures w14:val="none"/>
-                    </w:rPr>
-                    <w:t>2</w:t>
-                  </w:r>
-                </w:p>
-              </w:tc>
-              <w:tc>
-                <w:tcPr>
-                  <w:tcW w:w="2409" w:type="dxa"/>
-                  <w:tcBorders>
-                    <w:top w:val="nil"/>
-                    <w:left w:val="nil"/>
-                    <w:bottom w:val="nil"/>
-                    <w:right w:val="nil"/>
-                  </w:tcBorders>
-                  <w:noWrap/>
-                  <w:vAlign w:val="bottom"/>
-                  <w:hideMark/>
-                </w:tcPr>
-                <w:p>
-                  <w:pPr>
-                    <w:spacing w:after="0" w:line="240" w:lineRule="auto"/>
-                    <w:rPr>
-                      <w:rFonts w:ascii="Aptos Narrow" w:eastAsia="Times New Roman" w:hAnsi="Aptos Narrow" w:cs="Times New Roman"/>
-                      <w:kern w:val="0"/>
-                      <w:lang w:eastAsia="en-GB"/>
-                      <w14:ligatures w14:val="none"/>
-                    </w:rPr>
-                  </w:pPr>
-                  <w:r>
-                    <w:rPr>
-                      <w:rFonts w:ascii="Aptos Narrow" w:eastAsia="Times New Roman" w:hAnsi="Aptos Narrow" w:cs="Times New Roman"/>
-                      <w:kern w:val="0"/>
-                      <w:lang w:eastAsia="en-GB"/>
-                      <w14:ligatures w14:val="none"/>
-                    </w:rPr>
-                    <w:t>Sister</w:t>
-                  </w:r>
-                </w:p>
-              </w:tc>
-              <w:tc>
-                <w:tcPr>
-                  <w:tcW w:w="1060" w:type="dxa"/>
-                  <w:tcBorders>
-                    <w:top w:val="nil"/>
-                    <w:left w:val="nil"/>
-                    <w:bottom w:val="nil"/>
-                    <w:right w:val="nil"/>
-                  </w:tcBorders>
-                  <w:noWrap/>
-                  <w:vAlign w:val="bottom"/>
-                  <w:hideMark/>
-                </w:tcPr>
-                <w:p>
-                  <w:pPr>
-                    <w:spacing w:after="0" w:line="240" w:lineRule="auto"/>
-                    <w:jc w:val="right"/>
-                    <w:rPr>
-                      <w:rFonts w:ascii="Aptos Narrow" w:eastAsia="Times New Roman" w:hAnsi="Aptos Narrow" w:cs="Times New Roman"/>
-                      <w:kern w:val="0"/>
-                      <w:lang w:eastAsia="en-GB"/>
-                      <w14:ligatures w14:val="none"/>
-                    </w:rPr>
-                  </w:pPr>
-                  <w:r>
-                    <w:rPr>
-                      <w:rFonts w:ascii="Aptos Narrow" w:eastAsia="Times New Roman" w:hAnsi="Aptos Narrow" w:cs="Times New Roman"/>
-                      <w:kern w:val="0"/>
-                      <w:lang w:eastAsia="en-GB"/>
-                      <w14:ligatures w14:val="none"/>
-                    </w:rPr>
-                    <w:t>5</w:t>
-                  </w:r>
-                </w:p>
-              </w:tc>
-            </w:tr>
-            <w:tr>
-              <w:trPr>
-                <w:trHeight w:val="312"/>
-              </w:trPr>
-              <w:tc>
-                <w:tcPr>
-                  <w:tcW w:w="1060" w:type="dxa"/>
-                  <w:tcBorders>
-                    <w:top w:val="nil"/>
-                    <w:left w:val="nil"/>
-                    <w:bottom w:val="nil"/>
-                    <w:right w:val="nil"/>
-                  </w:tcBorders>
-                  <w:noWrap/>
-                  <w:vAlign w:val="bottom"/>
-                  <w:hideMark/>
-                </w:tcPr>
-                <w:p>
-                  <w:pPr>
-                    <w:spacing w:after="0" w:line="240" w:lineRule="auto"/>
-                    <w:jc w:val="right"/>
-                    <w:rPr>
-                      <w:rFonts w:ascii="Aptos Narrow" w:eastAsia="Times New Roman" w:hAnsi="Aptos Narrow" w:cs="Times New Roman"/>
-                      <w:kern w:val="0"/>
-                      <w:lang w:eastAsia="en-GB"/>
-                      <w14:ligatures w14:val="none"/>
-                    </w:rPr>
-                  </w:pPr>
-                  <w:r>
-                    <w:rPr>
-                      <w:rFonts w:ascii="Aptos Narrow" w:eastAsia="Times New Roman" w:hAnsi="Aptos Narrow" w:cs="Times New Roman"/>
-                      <w:kern w:val="0"/>
-                      <w:lang w:eastAsia="en-GB"/>
-                      <w14:ligatures w14:val="none"/>
-                    </w:rPr>
-                    <w:t>7</w:t>
-                  </w:r>
-                </w:p>
-              </w:tc>
-              <w:tc>
-                <w:tcPr>
-                  <w:tcW w:w="2409" w:type="dxa"/>
-                  <w:tcBorders>
-                    <w:top w:val="nil"/>
-                    <w:left w:val="nil"/>
-                    <w:bottom w:val="nil"/>
-                    <w:right w:val="nil"/>
-                  </w:tcBorders>
-                  <w:noWrap/>
-                  <w:vAlign w:val="bottom"/>
-                  <w:hideMark/>
-                </w:tcPr>
-                <w:p>
-                  <w:pPr>
-                    <w:spacing w:after="0" w:line="240" w:lineRule="auto"/>
-                    <w:rPr>
-                      <w:rFonts w:ascii="Aptos Narrow" w:eastAsia="Times New Roman" w:hAnsi="Aptos Narrow" w:cs="Times New Roman"/>
-                      <w:kern w:val="0"/>
-                      <w:lang w:eastAsia="en-GB"/>
-                      <w14:ligatures w14:val="none"/>
-                    </w:rPr>
-                  </w:pPr>
-                  <w:r>
-                    <w:rPr>
-                      <w:rFonts w:ascii="Aptos Narrow" w:eastAsia="Times New Roman" w:hAnsi="Aptos Narrow" w:cs="Times New Roman"/>
-                      <w:kern w:val="0"/>
-                      <w:lang w:eastAsia="en-GB"/>
-                      <w14:ligatures w14:val="none"/>
-                    </w:rPr>
-                    <w:t>Half Brother</w:t>
-                  </w:r>
-                </w:p>
-              </w:tc>
-              <w:tc>
-                <w:tcPr>
-                  <w:tcW w:w="1060" w:type="dxa"/>
-                  <w:tcBorders>
-                    <w:top w:val="nil"/>
-                    <w:left w:val="nil"/>
-                    <w:bottom w:val="nil"/>
-                    <w:right w:val="nil"/>
-                  </w:tcBorders>
-                  <w:noWrap/>
-                  <w:vAlign w:val="bottom"/>
-                  <w:hideMark/>
-                </w:tcPr>
-                <w:p>
-                  <w:pPr>
-                    <w:spacing w:after="0" w:line="240" w:lineRule="auto"/>
-                    <w:jc w:val="right"/>
-                    <w:rPr>
-                      <w:rFonts w:ascii="Aptos Narrow" w:eastAsia="Times New Roman" w:hAnsi="Aptos Narrow" w:cs="Times New Roman"/>
-                      <w:kern w:val="0"/>
-                      <w:lang w:eastAsia="en-GB"/>
-                      <w14:ligatures w14:val="none"/>
-                    </w:rPr>
-                  </w:pPr>
-                  <w:r>
-                    <w:rPr>
-                      <w:rFonts w:ascii="Aptos Narrow" w:eastAsia="Times New Roman" w:hAnsi="Aptos Narrow" w:cs="Times New Roman"/>
-                      <w:kern w:val="0"/>
-                      <w:lang w:eastAsia="en-GB"/>
-                      <w14:ligatures w14:val="none"/>
-                    </w:rPr>
-                    <w:t>10</w:t>
-                  </w:r>
-                </w:p>
-              </w:tc>
-            </w:tr>
-            <w:tr>
-              <w:trPr>
-                <w:trHeight w:val="312"/>
-              </w:trPr>
-              <w:tc>
-                <w:tcPr>
-                  <w:tcW w:w="1060" w:type="dxa"/>
-                  <w:tcBorders>
-                    <w:top w:val="nil"/>
-                    <w:left w:val="nil"/>
-                    <w:bottom w:val="nil"/>
-                    <w:right w:val="nil"/>
-                  </w:tcBorders>
-                  <w:noWrap/>
-                  <w:vAlign w:val="bottom"/>
-                  <w:hideMark/>
-                </w:tcPr>
-                <w:p>
-                  <w:pPr>
-                    <w:spacing w:after="0" w:line="240" w:lineRule="auto"/>
-                    <w:jc w:val="right"/>
-                    <w:rPr>
-                      <w:rFonts w:ascii="Aptos Narrow" w:eastAsia="Times New Roman" w:hAnsi="Aptos Narrow" w:cs="Times New Roman"/>
-                      <w:kern w:val="0"/>
-                      <w:lang w:eastAsia="en-GB"/>
-                      <w14:ligatures w14:val="none"/>
-                    </w:rPr>
-                  </w:pPr>
-                  <w:r>
-                    <w:rPr>
-                      <w:rFonts w:ascii="Aptos Narrow" w:eastAsia="Times New Roman" w:hAnsi="Aptos Narrow" w:cs="Times New Roman"/>
-                      <w:kern w:val="0"/>
-                      <w:lang w:eastAsia="en-GB"/>
-                      <w14:ligatures w14:val="none"/>
-                    </w:rPr>
-                    <w:t>8</w:t>
-                  </w:r>
-                </w:p>
-              </w:tc>
-              <w:tc>
-                <w:tcPr>
-                  <w:tcW w:w="2409" w:type="dxa"/>
-                  <w:tcBorders>
-                    <w:top w:val="nil"/>
-                    <w:left w:val="nil"/>
-                    <w:bottom w:val="nil"/>
-                    <w:right w:val="nil"/>
-                  </w:tcBorders>
-                  <w:noWrap/>
-                  <w:vAlign w:val="bottom"/>
-                  <w:hideMark/>
-                </w:tcPr>
-                <w:p>
-                  <w:pPr>
-                    <w:spacing w:after="0" w:line="240" w:lineRule="auto"/>
-                    <w:rPr>
-                      <w:rFonts w:ascii="Aptos Narrow" w:eastAsia="Times New Roman" w:hAnsi="Aptos Narrow" w:cs="Times New Roman"/>
-                      <w:kern w:val="0"/>
-                      <w:lang w:eastAsia="en-GB"/>
-                      <w14:ligatures w14:val="none"/>
-                    </w:rPr>
-                  </w:pPr>
-                  <w:r>
-                    <w:rPr>
-                      <w:rFonts w:ascii="Aptos Narrow" w:eastAsia="Times New Roman" w:hAnsi="Aptos Narrow" w:cs="Times New Roman"/>
-                      <w:kern w:val="0"/>
-                      <w:lang w:eastAsia="en-GB"/>
-                      <w14:ligatures w14:val="none"/>
-                    </w:rPr>
-                    <w:t>Half Sister</w:t>
-                  </w:r>
-                </w:p>
-              </w:tc>
-              <w:tc>
-                <w:tcPr>
-                  <w:tcW w:w="1060" w:type="dxa"/>
-                  <w:tcBorders>
-                    <w:top w:val="nil"/>
-                    <w:left w:val="nil"/>
-                    <w:bottom w:val="nil"/>
-                    <w:right w:val="nil"/>
-                  </w:tcBorders>
-                  <w:noWrap/>
-                  <w:vAlign w:val="bottom"/>
-                  <w:hideMark/>
-                </w:tcPr>
-                <w:p>
-                  <w:pPr>
-                    <w:spacing w:after="0" w:line="240" w:lineRule="auto"/>
-                    <w:jc w:val="right"/>
-                    <w:rPr>
-                      <w:rFonts w:ascii="Aptos Narrow" w:eastAsia="Times New Roman" w:hAnsi="Aptos Narrow" w:cs="Times New Roman"/>
-                      <w:kern w:val="0"/>
-                      <w:lang w:eastAsia="en-GB"/>
-                      <w14:ligatures w14:val="none"/>
-                    </w:rPr>
-                  </w:pPr>
-                  <w:r>
-                    <w:rPr>
-                      <w:rFonts w:ascii="Aptos Narrow" w:eastAsia="Times New Roman" w:hAnsi="Aptos Narrow" w:cs="Times New Roman"/>
-                      <w:kern w:val="0"/>
-                      <w:lang w:eastAsia="en-GB"/>
-                      <w14:ligatures w14:val="none"/>
-                    </w:rPr>
-                    <w:t>15</w:t>
-                  </w:r>
-                </w:p>
-              </w:tc>
-            </w:tr>
-            <w:tr>
-              <w:trPr>
-                <w:trHeight w:val="312"/>
-              </w:trPr>
-              <w:tc>
-                <w:tcPr>
-                  <w:tcW w:w="1060" w:type="dxa"/>
-                  <w:tcBorders>
-                    <w:top w:val="nil"/>
-                    <w:left w:val="nil"/>
-                    <w:bottom w:val="nil"/>
-                    <w:right w:val="nil"/>
-                  </w:tcBorders>
-                  <w:noWrap/>
-                  <w:vAlign w:val="bottom"/>
-                  <w:hideMark/>
-                </w:tcPr>
-                <w:p>
-                  <w:pPr>
-                    <w:spacing w:after="0" w:line="240" w:lineRule="auto"/>
-                    <w:jc w:val="right"/>
-                    <w:rPr>
-                      <w:rFonts w:ascii="Aptos Narrow" w:eastAsia="Times New Roman" w:hAnsi="Aptos Narrow" w:cs="Times New Roman"/>
-                      <w:kern w:val="0"/>
-                      <w:lang w:eastAsia="en-GB"/>
-                      <w14:ligatures w14:val="none"/>
-                    </w:rPr>
-                  </w:pPr>
-                  <w:r>
-                    <w:rPr>
-                      <w:rFonts w:ascii="Aptos Narrow" w:eastAsia="Times New Roman" w:hAnsi="Aptos Narrow" w:cs="Times New Roman"/>
-                      <w:kern w:val="0"/>
-                      <w:lang w:eastAsia="en-GB"/>
-                      <w14:ligatures w14:val="none"/>
-                    </w:rPr>
-                    <w:t>5</w:t>
-                  </w:r>
-                </w:p>
-              </w:tc>
-              <w:tc>
-                <w:tcPr>
-                  <w:tcW w:w="2409" w:type="dxa"/>
-                  <w:tcBorders>
-                    <w:top w:val="nil"/>
-                    <w:left w:val="nil"/>
-                    <w:bottom w:val="nil"/>
-                    <w:right w:val="nil"/>
-                  </w:tcBorders>
-                  <w:noWrap/>
-                  <w:vAlign w:val="bottom"/>
-                  <w:hideMark/>
-                </w:tcPr>
-                <w:p>
-                  <w:pPr>
-                    <w:spacing w:after="0" w:line="240" w:lineRule="auto"/>
-                    <w:rPr>
-                      <w:rFonts w:ascii="Aptos Narrow" w:eastAsia="Times New Roman" w:hAnsi="Aptos Narrow" w:cs="Times New Roman"/>
-                      <w:kern w:val="0"/>
-                      <w:lang w:eastAsia="en-GB"/>
-                      <w14:ligatures w14:val="none"/>
-                    </w:rPr>
-                  </w:pPr>
-                  <w:proofErr w:type="gramStart"/>
-                  <w:r>
-                    <w:rPr>
-                      <w:rFonts w:ascii="Aptos Narrow" w:eastAsia="Times New Roman" w:hAnsi="Aptos Narrow" w:cs="Times New Roman"/>
-                      <w:kern w:val="0"/>
-                      <w:lang w:eastAsia="en-GB"/>
-                      <w14:ligatures w14:val="none"/>
-                    </w:rPr>
-                    <w:t>Step Brother</w:t>
-                  </w:r>
-                  <w:proofErr w:type="gramEnd"/>
-                </w:p>
-              </w:tc>
-              <w:tc>
-                <w:tcPr>
-                  <w:tcW w:w="1060" w:type="dxa"/>
-                  <w:tcBorders>
-                    <w:top w:val="nil"/>
-                    <w:left w:val="nil"/>
-                    <w:bottom w:val="nil"/>
-                    <w:right w:val="nil"/>
-                  </w:tcBorders>
-                  <w:noWrap/>
-                  <w:vAlign w:val="bottom"/>
-                  <w:hideMark/>
-                </w:tcPr>
-                <w:p>
-                  <w:pPr>
-                    <w:spacing w:after="0" w:line="240" w:lineRule="auto"/>
-                    <w:jc w:val="right"/>
-                    <w:rPr>
-                      <w:rFonts w:ascii="Aptos Narrow" w:eastAsia="Times New Roman" w:hAnsi="Aptos Narrow" w:cs="Times New Roman"/>
-                      <w:kern w:val="0"/>
-                      <w:lang w:eastAsia="en-GB"/>
-                      <w14:ligatures w14:val="none"/>
-                    </w:rPr>
-                  </w:pPr>
-                  <w:r>
-                    <w:rPr>
-                      <w:rFonts w:ascii="Aptos Narrow" w:eastAsia="Times New Roman" w:hAnsi="Aptos Narrow" w:cs="Times New Roman"/>
-                      <w:kern w:val="0"/>
-                      <w:lang w:eastAsia="en-GB"/>
-                      <w14:ligatures w14:val="none"/>
-                    </w:rPr>
-                    <w:t>30</w:t>
-                  </w:r>
-                </w:p>
-              </w:tc>
-            </w:tr>
-            <w:tr>
-              <w:trPr>
-                <w:trHeight w:val="312"/>
-              </w:trPr>
-              <w:tc>
-                <w:tcPr>
-                  <w:tcW w:w="1060" w:type="dxa"/>
-                  <w:tcBorders>
-                    <w:top w:val="nil"/>
-                    <w:left w:val="nil"/>
-                    <w:bottom w:val="nil"/>
-                    <w:right w:val="nil"/>
-                  </w:tcBorders>
-                  <w:noWrap/>
-                  <w:vAlign w:val="bottom"/>
-                  <w:hideMark/>
-                </w:tcPr>
-                <w:p>
-                  <w:pPr>
-                    <w:spacing w:after="0" w:line="240" w:lineRule="auto"/>
-                    <w:jc w:val="right"/>
-                    <w:rPr>
-                      <w:rFonts w:ascii="Aptos Narrow" w:eastAsia="Times New Roman" w:hAnsi="Aptos Narrow" w:cs="Times New Roman"/>
-                      <w:kern w:val="0"/>
-                      <w:lang w:eastAsia="en-GB"/>
-                      <w14:ligatures w14:val="none"/>
-                    </w:rPr>
-                  </w:pPr>
-                  <w:r>
-                    <w:rPr>
-                      <w:rFonts w:ascii="Aptos Narrow" w:eastAsia="Times New Roman" w:hAnsi="Aptos Narrow" w:cs="Times New Roman"/>
-                      <w:kern w:val="0"/>
-                      <w:lang w:eastAsia="en-GB"/>
-                      <w14:ligatures w14:val="none"/>
-                    </w:rPr>
-                    <w:t>6</w:t>
-                  </w:r>
-                </w:p>
-              </w:tc>
-              <w:tc>
-                <w:tcPr>
-                  <w:tcW w:w="2409" w:type="dxa"/>
-                  <w:tcBorders>
-                    <w:top w:val="nil"/>
-                    <w:left w:val="nil"/>
-                    <w:bottom w:val="nil"/>
-                    <w:right w:val="nil"/>
-                  </w:tcBorders>
-                  <w:noWrap/>
-                  <w:vAlign w:val="bottom"/>
-                  <w:hideMark/>
-                </w:tcPr>
-                <w:p>
-                  <w:pPr>
-                    <w:spacing w:after="0" w:line="240" w:lineRule="auto"/>
-                    <w:rPr>
-                      <w:rFonts w:ascii="Aptos Narrow" w:eastAsia="Times New Roman" w:hAnsi="Aptos Narrow" w:cs="Times New Roman"/>
-                      <w:kern w:val="0"/>
-                      <w:lang w:eastAsia="en-GB"/>
-                      <w14:ligatures w14:val="none"/>
-                    </w:rPr>
-                  </w:pPr>
-                  <w:proofErr w:type="gramStart"/>
-                  <w:r>
-                    <w:rPr>
-                      <w:rFonts w:ascii="Aptos Narrow" w:eastAsia="Times New Roman" w:hAnsi="Aptos Narrow" w:cs="Times New Roman"/>
-                      <w:kern w:val="0"/>
-                      <w:lang w:eastAsia="en-GB"/>
-                      <w14:ligatures w14:val="none"/>
-                    </w:rPr>
-                    <w:t>Step Sister</w:t>
-                  </w:r>
-                  <w:proofErr w:type="gramEnd"/>
-                </w:p>
-              </w:tc>
-              <w:tc>
-                <w:tcPr>
-                  <w:tcW w:w="1060" w:type="dxa"/>
-                  <w:tcBorders>
-                    <w:top w:val="nil"/>
-                    <w:left w:val="nil"/>
-                    <w:bottom w:val="nil"/>
-                    <w:right w:val="nil"/>
-                  </w:tcBorders>
-                  <w:noWrap/>
-                  <w:vAlign w:val="bottom"/>
-                  <w:hideMark/>
-                </w:tcPr>
-                <w:p>
-                  <w:pPr>
-                    <w:spacing w:after="0" w:line="240" w:lineRule="auto"/>
-                    <w:jc w:val="right"/>
-                    <w:rPr>
-                      <w:rFonts w:ascii="Aptos Narrow" w:eastAsia="Times New Roman" w:hAnsi="Aptos Narrow" w:cs="Times New Roman"/>
-                      <w:kern w:val="0"/>
-                      <w:lang w:eastAsia="en-GB"/>
-                      <w14:ligatures w14:val="none"/>
-                    </w:rPr>
-                  </w:pPr>
-                  <w:r>
-                    <w:rPr>
-                      <w:rFonts w:ascii="Aptos Narrow" w:eastAsia="Times New Roman" w:hAnsi="Aptos Narrow" w:cs="Times New Roman"/>
-                      <w:kern w:val="0"/>
-                      <w:lang w:eastAsia="en-GB"/>
-                      <w14:ligatures w14:val="none"/>
-                    </w:rPr>
-                    <w:t>35</w:t>
-                  </w:r>
-                </w:p>
-              </w:tc>
-            </w:tr>
-            <w:tr>
-              <w:trPr>
-                <w:trHeight w:val="312"/>
-              </w:trPr>
-              <w:tc>
-                <w:tcPr>
-                  <w:tcW w:w="1060" w:type="dxa"/>
-                  <w:tcBorders>
-                    <w:top w:val="nil"/>
-                    <w:left w:val="nil"/>
-                    <w:bottom w:val="nil"/>
-                    <w:right w:val="nil"/>
-                  </w:tcBorders>
-                  <w:noWrap/>
-                  <w:vAlign w:val="bottom"/>
-                  <w:hideMark/>
-                </w:tcPr>
-                <w:p>
-                  <w:pPr>
-                    <w:spacing w:after="0" w:line="240" w:lineRule="auto"/>
-                    <w:jc w:val="right"/>
-                    <w:rPr>
-                      <w:rFonts w:ascii="Aptos Narrow" w:eastAsia="Times New Roman" w:hAnsi="Aptos Narrow" w:cs="Times New Roman"/>
-                      <w:kern w:val="0"/>
-                      <w:lang w:eastAsia="en-GB"/>
-                      <w14:ligatures w14:val="none"/>
-                    </w:rPr>
-                  </w:pPr>
-                  <w:r>
-                    <w:rPr>
-                      <w:rFonts w:ascii="Aptos Narrow" w:eastAsia="Times New Roman" w:hAnsi="Aptos Narrow" w:cs="Times New Roman"/>
-                      <w:kern w:val="0"/>
-                      <w:lang w:eastAsia="en-GB"/>
-                      <w14:ligatures w14:val="none"/>
-                    </w:rPr>
-                    <w:t>3</w:t>
-                  </w:r>
-                </w:p>
-              </w:tc>
-              <w:tc>
-                <w:tcPr>
-                  <w:tcW w:w="2409" w:type="dxa"/>
-                  <w:tcBorders>
-                    <w:top w:val="nil"/>
-                    <w:left w:val="nil"/>
-                    <w:bottom w:val="nil"/>
-                    <w:right w:val="nil"/>
-                  </w:tcBorders>
-                  <w:noWrap/>
-                  <w:vAlign w:val="bottom"/>
-                  <w:hideMark/>
-                </w:tcPr>
-                <w:p>
-                  <w:pPr>
-                    <w:spacing w:after="0" w:line="240" w:lineRule="auto"/>
-                    <w:rPr>
-                      <w:rFonts w:ascii="Aptos Narrow" w:eastAsia="Times New Roman" w:hAnsi="Aptos Narrow" w:cs="Times New Roman"/>
-                      <w:kern w:val="0"/>
-                      <w:lang w:eastAsia="en-GB"/>
-                      <w14:ligatures w14:val="none"/>
-                    </w:rPr>
-                  </w:pPr>
-                  <w:r>
-                    <w:rPr>
-                      <w:rFonts w:ascii="Aptos Narrow" w:eastAsia="Times New Roman" w:hAnsi="Aptos Narrow" w:cs="Times New Roman"/>
-                      <w:kern w:val="0"/>
-                      <w:lang w:eastAsia="en-GB"/>
-                      <w14:ligatures w14:val="none"/>
-                    </w:rPr>
-                    <w:t>Parent and Child - Parent</w:t>
-                  </w:r>
-                </w:p>
-              </w:tc>
-              <w:tc>
-                <w:tcPr>
-                  <w:tcW w:w="1060" w:type="dxa"/>
-                  <w:tcBorders>
-                    <w:top w:val="nil"/>
-                    <w:left w:val="nil"/>
-                    <w:bottom w:val="nil"/>
-                    <w:right w:val="nil"/>
-                  </w:tcBorders>
-                  <w:noWrap/>
-                  <w:vAlign w:val="bottom"/>
-                  <w:hideMark/>
-                </w:tcPr>
-                <w:p>
-                  <w:pPr>
-                    <w:spacing w:after="0" w:line="240" w:lineRule="auto"/>
-                    <w:jc w:val="right"/>
-                    <w:rPr>
-                      <w:rFonts w:ascii="Aptos Narrow" w:eastAsia="Times New Roman" w:hAnsi="Aptos Narrow" w:cs="Times New Roman"/>
-                      <w:kern w:val="0"/>
-                      <w:lang w:eastAsia="en-GB"/>
-                      <w14:ligatures w14:val="none"/>
-                    </w:rPr>
-                  </w:pPr>
-                  <w:r>
-                    <w:rPr>
-                      <w:rFonts w:ascii="Aptos Narrow" w:eastAsia="Times New Roman" w:hAnsi="Aptos Narrow" w:cs="Times New Roman"/>
-                      <w:kern w:val="0"/>
-                      <w:lang w:eastAsia="en-GB"/>
-                      <w14:ligatures w14:val="none"/>
-                    </w:rPr>
-                    <w:t>50</w:t>
-                  </w:r>
-                </w:p>
-              </w:tc>
-            </w:tr>
-            <w:tr>
-              <w:trPr>
-                <w:trHeight w:val="312"/>
-              </w:trPr>
-              <w:tc>
-                <w:tcPr>
-                  <w:tcW w:w="1060" w:type="dxa"/>
-                  <w:tcBorders>
-                    <w:top w:val="nil"/>
-                    <w:left w:val="nil"/>
-                    <w:bottom w:val="nil"/>
-                    <w:right w:val="nil"/>
-                  </w:tcBorders>
-                  <w:noWrap/>
-                  <w:vAlign w:val="bottom"/>
-                  <w:hideMark/>
-                </w:tcPr>
-                <w:p>
-                  <w:pPr>
-                    <w:spacing w:after="0" w:line="240" w:lineRule="auto"/>
-                    <w:jc w:val="right"/>
-                    <w:rPr>
-                      <w:rFonts w:ascii="Aptos Narrow" w:eastAsia="Times New Roman" w:hAnsi="Aptos Narrow" w:cs="Times New Roman"/>
-                      <w:kern w:val="0"/>
-                      <w:lang w:eastAsia="en-GB"/>
-                      <w14:ligatures w14:val="none"/>
-                    </w:rPr>
-                  </w:pPr>
-                  <w:r>
-                    <w:rPr>
-                      <w:rFonts w:ascii="Aptos Narrow" w:eastAsia="Times New Roman" w:hAnsi="Aptos Narrow" w:cs="Times New Roman"/>
-                      <w:kern w:val="0"/>
-                      <w:lang w:eastAsia="en-GB"/>
-                      <w14:ligatures w14:val="none"/>
-                    </w:rPr>
-                    <w:t>4</w:t>
-                  </w:r>
-                </w:p>
-              </w:tc>
-              <w:tc>
-                <w:tcPr>
-                  <w:tcW w:w="2409" w:type="dxa"/>
-                  <w:tcBorders>
-                    <w:top w:val="nil"/>
-                    <w:left w:val="nil"/>
-                    <w:bottom w:val="nil"/>
-                    <w:right w:val="nil"/>
-                  </w:tcBorders>
-                  <w:noWrap/>
-                  <w:vAlign w:val="bottom"/>
-                  <w:hideMark/>
-                </w:tcPr>
-                <w:p>
-                  <w:pPr>
-                    <w:spacing w:after="0" w:line="240" w:lineRule="auto"/>
-                    <w:rPr>
-                      <w:rFonts w:ascii="Aptos Narrow" w:eastAsia="Times New Roman" w:hAnsi="Aptos Narrow" w:cs="Times New Roman"/>
-                      <w:kern w:val="0"/>
-                      <w:lang w:eastAsia="en-GB"/>
-                      <w14:ligatures w14:val="none"/>
-                    </w:rPr>
-                  </w:pPr>
-                  <w:r>
-                    <w:rPr>
-                      <w:rFonts w:ascii="Aptos Narrow" w:eastAsia="Times New Roman" w:hAnsi="Aptos Narrow" w:cs="Times New Roman"/>
-                      <w:kern w:val="0"/>
-                      <w:lang w:eastAsia="en-GB"/>
-                      <w14:ligatures w14:val="none"/>
-                    </w:rPr>
-                    <w:t>Parent and Child - Child</w:t>
-                  </w:r>
-                </w:p>
-              </w:tc>
-              <w:tc>
-                <w:tcPr>
-                  <w:tcW w:w="1060" w:type="dxa"/>
-                  <w:tcBorders>
-                    <w:top w:val="nil"/>
-                    <w:left w:val="nil"/>
-                    <w:bottom w:val="nil"/>
-                    <w:right w:val="nil"/>
-                  </w:tcBorders>
-                  <w:noWrap/>
-                  <w:vAlign w:val="bottom"/>
-                  <w:hideMark/>
-                </w:tcPr>
-                <w:p>
-                  <w:pPr>
-                    <w:spacing w:after="0" w:line="240" w:lineRule="auto"/>
-                    <w:jc w:val="right"/>
-                    <w:rPr>
-                      <w:rFonts w:ascii="Aptos Narrow" w:eastAsia="Times New Roman" w:hAnsi="Aptos Narrow" w:cs="Times New Roman"/>
-                      <w:kern w:val="0"/>
-                      <w:lang w:eastAsia="en-GB"/>
-                      <w14:ligatures w14:val="none"/>
-                    </w:rPr>
-                  </w:pPr>
-                  <w:r>
-                    <w:rPr>
-                      <w:rFonts w:ascii="Aptos Narrow" w:eastAsia="Times New Roman" w:hAnsi="Aptos Narrow" w:cs="Times New Roman"/>
-                      <w:kern w:val="0"/>
-                      <w:lang w:eastAsia="en-GB"/>
-                      <w14:ligatures w14:val="none"/>
-                    </w:rPr>
-                    <w:t>55</w:t>
-                  </w:r>
-                </w:p>
-              </w:tc>
-            </w:tr>
-          </w:tbl>
-          <w:p/>
+          <w:p>
+            <w:r>
+              <w:t>Brother/ Sister</w:t>
+            </w:r>
+          </w:p>
+          <w:p>
+            <w:r>
+              <w:t>Half Brother/ Half Sister</w:t>
+            </w:r>
+          </w:p>
+          <w:p>
+            <w:proofErr w:type="gramStart"/>
+            <w:r>
+              <w:t>Step Brother</w:t>
+            </w:r>
+            <w:proofErr w:type="gramEnd"/>
+            <w:r>
+              <w:t xml:space="preserve">/ </w:t>
+            </w:r>
+            <w:proofErr w:type="gramStart"/>
+            <w:r>
+              <w:t>Step Sister</w:t>
+            </w:r>
+            <w:proofErr w:type="gramEnd"/>
+          </w:p>
+          <w:p>
+            <w:r>
+              <w:t>Parent and Child – Parent</w:t>
+            </w:r>
+          </w:p>
+          <w:p>
+            <w:r>
+              <w:t>Parent and Child - Child</w:t>
+            </w:r>
+          </w:p>
         </w:tc>
       </w:tr>
     </w:tbl>
@@ -3071,26 +2113,6 @@
 </file>
 
 <file path=customXml/item1.xml><?xml version="1.0" encoding="utf-8"?>
-<?mso-contentType ?>
-<FormTemplates xmlns="http://schemas.microsoft.com/sharepoint/v3/contenttype/forms">
-  <Display>DocumentLibraryForm</Display>
-  <Edit>DocumentLibraryForm</Edit>
-  <New>DocumentLibraryForm</New>
-</FormTemplates>
-</file>
-
-<file path=customXml/item2.xml><?xml version="1.0" encoding="utf-8"?>
-<p:properties xmlns:p="http://schemas.microsoft.com/office/2006/metadata/properties" xmlns:xsi="http://www.w3.org/2001/XMLSchema-instance" xmlns:pc="http://schemas.microsoft.com/office/infopath/2007/PartnerControls">
-  <documentManagement>
-    <lcf76f155ced4ddcb4097134ff3c332f xmlns="d981d730-cbae-4e7b-b1b9-e58d358f9b74">
-      <Terms xmlns="http://schemas.microsoft.com/office/infopath/2007/PartnerControls"/>
-    </lcf76f155ced4ddcb4097134ff3c332f>
-    <TaxCatchAll xmlns="a177af71-9a5e-4e96-8998-41ddd644bae2" xsi:nil="true"/>
-  </documentManagement>
-</p:properties>
-</file>
-
-<file path=customXml/item3.xml><?xml version="1.0" encoding="utf-8"?>
 <ct:contentTypeSchema xmlns:ct="http://schemas.microsoft.com/office/2006/metadata/contentType" xmlns:ma="http://schemas.microsoft.com/office/2006/metadata/properties/metaAttributes" ct:_="" ma:_="" ma:contentTypeName="Document" ma:contentTypeID="0x0101004E0942F068A51341811C6031642F533D" ma:contentTypeVersion="21" ma:contentTypeDescription="Create a new document." ma:contentTypeScope="" ma:versionID="97405257797b181224210849ebb5ef04">
   <xsd:schema xmlns:xsd="http://www.w3.org/2001/XMLSchema" xmlns:xs="http://www.w3.org/2001/XMLSchema" xmlns:p="http://schemas.microsoft.com/office/2006/metadata/properties" xmlns:ns2="a177af71-9a5e-4e96-8998-41ddd644bae2" xmlns:ns3="d981d730-cbae-4e7b-b1b9-e58d358f9b74" targetNamespace="http://schemas.microsoft.com/office/2006/metadata/properties" ma:root="true" ma:fieldsID="d216ad4ef2bbf45ce58500147720a641" ns2:_="" ns3:_="">
     <xsd:import namespace="a177af71-9a5e-4e96-8998-41ddd644bae2"/>
@@ -3331,10 +2353,41 @@
 </ct:contentTypeSchema>
 </file>
 
+<file path=customXml/item2.xml><?xml version="1.0" encoding="utf-8"?>
+<p:properties xmlns:p="http://schemas.microsoft.com/office/2006/metadata/properties" xmlns:xsi="http://www.w3.org/2001/XMLSchema-instance" xmlns:pc="http://schemas.microsoft.com/office/infopath/2007/PartnerControls">
+  <documentManagement>
+    <lcf76f155ced4ddcb4097134ff3c332f xmlns="d981d730-cbae-4e7b-b1b9-e58d358f9b74">
+      <Terms xmlns="http://schemas.microsoft.com/office/infopath/2007/PartnerControls"/>
+    </lcf76f155ced4ddcb4097134ff3c332f>
+    <TaxCatchAll xmlns="a177af71-9a5e-4e96-8998-41ddd644bae2" xsi:nil="true"/>
+  </documentManagement>
+</p:properties>
+</file>
+
+<file path=customXml/item3.xml><?xml version="1.0" encoding="utf-8"?>
+<?mso-contentType ?>
+<FormTemplates xmlns="http://schemas.microsoft.com/sharepoint/v3/contenttype/forms">
+  <Display>DocumentLibraryForm</Display>
+  <Edit>DocumentLibraryForm</Edit>
+  <New>DocumentLibraryForm</New>
+</FormTemplates>
+</file>
+
 <file path=customXml/itemProps1.xml><?xml version="1.0" encoding="utf-8"?>
-<ds:datastoreItem xmlns:ds="http://schemas.openxmlformats.org/officeDocument/2006/customXml" ds:itemID="{37A56531-0DFE-4B5D-A9DB-713266299EAF}">
+<ds:datastoreItem xmlns:ds="http://schemas.openxmlformats.org/officeDocument/2006/customXml" ds:itemID="{A713B942-5F1D-4062-862E-8E86D2BF3837}">
   <ds:schemaRefs>
-    <ds:schemaRef ds:uri="http://schemas.microsoft.com/sharepoint/v3/contenttype/forms"/>
+    <ds:schemaRef ds:uri="http://schemas.microsoft.com/office/2006/metadata/contentType"/>
+    <ds:schemaRef ds:uri="http://schemas.microsoft.com/office/2006/metadata/properties/metaAttributes"/>
+    <ds:schemaRef ds:uri="http://www.w3.org/2001/XMLSchema"/>
+    <ds:schemaRef ds:uri="http://schemas.microsoft.com/office/2006/metadata/properties"/>
+    <ds:schemaRef ds:uri="a177af71-9a5e-4e96-8998-41ddd644bae2"/>
+    <ds:schemaRef ds:uri="d981d730-cbae-4e7b-b1b9-e58d358f9b74"/>
+    <ds:schemaRef ds:uri="http://schemas.microsoft.com/office/2006/documentManagement/types"/>
+    <ds:schemaRef ds:uri="http://schemas.microsoft.com/office/infopath/2007/PartnerControls"/>
+    <ds:schemaRef ds:uri="http://schemas.openxmlformats.org/package/2006/metadata/core-properties"/>
+    <ds:schemaRef ds:uri="http://purl.org/dc/elements/1.1/"/>
+    <ds:schemaRef ds:uri="http://purl.org/dc/terms/"/>
+    <ds:schemaRef ds:uri="http://schemas.microsoft.com/internal/obd"/>
   </ds:schemaRefs>
 </ds:datastoreItem>
 </file>
@@ -3351,5 +2404,9 @@
 </file>
 
 <file path=customXml/itemProps3.xml><?xml version="1.0" encoding="utf-8"?>
-<ds:datastoreItem xmlns:ds="http://schemas.openxmlformats.org/officeDocument/2006/customXml" ds:itemID="{A713B942-5F1D-4062-862E-8E86D2BF3837}"/>
+<ds:datastoreItem xmlns:ds="http://schemas.openxmlformats.org/officeDocument/2006/customXml" ds:itemID="{37A56531-0DFE-4B5D-A9DB-713266299EAF}">
+  <ds:schemaRefs>
+    <ds:schemaRef ds:uri="http://schemas.microsoft.com/sharepoint/v3/contenttype/forms"/>
+  </ds:schemaRefs>
+</ds:datastoreItem>
 </file>
</xml_diff>

<commit_message>
August Changelog changed to September
</commit_message>
<xml_diff>
--- a/Documents/Changelog- CHARMS.docx
+++ b/Documents/Changelog- CHARMS.docx
@@ -42,7 +42,14 @@
           <w:sz w:val="32"/>
           <w:szCs w:val="32"/>
         </w:rPr>
-        <w:t>July 2026</w:t>
+        <w:t>September</w:t>
+      </w:r>
+      <w:r>
+        <w:rPr>
+          <w:sz w:val="32"/>
+          <w:szCs w:val="32"/>
+        </w:rPr>
+        <w:t xml:space="preserve"> 2026</w:t>
       </w:r>
     </w:p>
     <w:p>
@@ -161,229 +168,71 @@
         <w:tc>
           <w:tcPr>
             <w:tcW w:w="1405" w:type="dxa"/>
+            <w:shd w:val="clear" w:color="auto" w:fill="45B0E1" w:themeFill="accent1" w:themeFillTint="99"/>
           </w:tcPr>
           <w:p>
             <w:pPr>
               <w:jc w:val="center"/>
             </w:pPr>
-            <w:r>
-              <w:t>3/7/2026</w:t>
-            </w:r>
           </w:p>
         </w:tc>
         <w:tc>
           <w:tcPr>
             <w:tcW w:w="1335" w:type="dxa"/>
+            <w:shd w:val="clear" w:color="auto" w:fill="45B0E1" w:themeFill="accent1" w:themeFillTint="99"/>
           </w:tcPr>
           <w:p>
             <w:pPr>
               <w:jc w:val="center"/>
             </w:pPr>
-            <w:r>
-              <w:t>Katie Sell</w:t>
-            </w:r>
           </w:p>
         </w:tc>
         <w:tc>
           <w:tcPr>
             <w:tcW w:w="1473" w:type="dxa"/>
+            <w:shd w:val="clear" w:color="auto" w:fill="45B0E1" w:themeFill="accent1" w:themeFillTint="99"/>
           </w:tcPr>
           <w:p>
             <w:pPr>
               <w:jc w:val="center"/>
             </w:pPr>
-            <w:r>
-              <w:t>Katie Sell</w:t>
-            </w:r>
           </w:p>
         </w:tc>
         <w:tc>
           <w:tcPr>
             <w:tcW w:w="1403" w:type="dxa"/>
+            <w:shd w:val="clear" w:color="auto" w:fill="45B0E1" w:themeFill="accent1" w:themeFillTint="99"/>
           </w:tcPr>
           <w:p>
             <w:pPr>
               <w:jc w:val="center"/>
             </w:pPr>
-            <w:r>
-              <w:t>Nick Crabbe</w:t>
-            </w:r>
           </w:p>
         </w:tc>
         <w:tc>
           <w:tcPr>
             <w:tcW w:w="1325" w:type="dxa"/>
+            <w:shd w:val="clear" w:color="auto" w:fill="45B0E1" w:themeFill="accent1" w:themeFillTint="99"/>
           </w:tcPr>
           <w:p>
             <w:pPr>
               <w:jc w:val="center"/>
             </w:pPr>
-            <w:r>
-              <w:t>Progress</w:t>
-            </w:r>
           </w:p>
         </w:tc>
         <w:tc>
           <w:tcPr>
             <w:tcW w:w="8505" w:type="dxa"/>
-          </w:tcPr>
-          <w:p>
-            <w:r>
-              <w:t>New Progress action added “</w:t>
-            </w:r>
-            <w:r>
-              <w:t>FUSE support provided to carer</w:t>
-            </w:r>
-            <w:r>
-              <w:t>”. Used where a FUSE CHARMS log is generated by a user offering education and training support to a carer via FUSE.</w:t>
-            </w:r>
-          </w:p>
-          <w:p/>
-        </w:tc>
-      </w:tr>
-      <w:tr>
-        <w:tc>
-          <w:tcPr>
-            <w:tcW w:w="1405" w:type="dxa"/>
+            <w:shd w:val="clear" w:color="auto" w:fill="45B0E1" w:themeFill="accent1" w:themeFillTint="99"/>
           </w:tcPr>
           <w:p>
             <w:pPr>
               <w:jc w:val="center"/>
             </w:pPr>
-            <w:r>
-              <w:t>3/7/2-26</w:t>
-            </w:r>
-          </w:p>
-        </w:tc>
-        <w:tc>
-          <w:tcPr>
-            <w:tcW w:w="1335" w:type="dxa"/>
-          </w:tcPr>
-          <w:p>
-            <w:pPr>
-              <w:jc w:val="center"/>
-            </w:pPr>
-            <w:r>
-              <w:t xml:space="preserve">Result of </w:t>
-            </w:r>
-            <w:r>
-              <w:t xml:space="preserve">the </w:t>
-            </w:r>
-            <w:r>
-              <w:t>latest upgrade.</w:t>
-            </w:r>
-          </w:p>
-        </w:tc>
-        <w:tc>
-          <w:tcPr>
-            <w:tcW w:w="1473" w:type="dxa"/>
-          </w:tcPr>
-          <w:p>
-            <w:pPr>
-              <w:jc w:val="center"/>
-            </w:pPr>
-            <w:r>
-              <w:t>Alex Lyne</w:t>
-            </w:r>
-          </w:p>
-        </w:tc>
-        <w:tc>
-          <w:tcPr>
-            <w:tcW w:w="1403" w:type="dxa"/>
-          </w:tcPr>
-          <w:p>
-            <w:pPr>
-              <w:jc w:val="center"/>
-            </w:pPr>
-            <w:r>
-              <w:t>Nick Crabbe</w:t>
-            </w:r>
-          </w:p>
-        </w:tc>
-        <w:tc>
-          <w:tcPr>
-            <w:tcW w:w="1325" w:type="dxa"/>
-          </w:tcPr>
-          <w:p>
-            <w:pPr>
-              <w:jc w:val="center"/>
-            </w:pPr>
-            <w:r>
-              <w:t>Child Main details</w:t>
-            </w:r>
-          </w:p>
-        </w:tc>
-        <w:tc>
-          <w:tcPr>
-            <w:tcW w:w="8505" w:type="dxa"/>
-          </w:tcPr>
-          <w:p>
-            <w:r>
-              <w:t>Added the following as options on the new Sibling relationships dropdown on Child Main details:</w:t>
-            </w:r>
-          </w:p>
-          <w:p>
-            <w:r>
-              <w:t>Brother/ Sister</w:t>
-            </w:r>
-          </w:p>
-          <w:p>
-            <w:r>
-              <w:t>Half Brother/ Half Sister</w:t>
-            </w:r>
-          </w:p>
-          <w:p>
-            <w:proofErr w:type="gramStart"/>
-            <w:r>
-              <w:t>Step Brother</w:t>
-            </w:r>
-            <w:proofErr w:type="gramEnd"/>
-            <w:r>
-              <w:t xml:space="preserve">/ </w:t>
-            </w:r>
-            <w:proofErr w:type="gramStart"/>
-            <w:r>
-              <w:t>Step Sister</w:t>
-            </w:r>
-            <w:proofErr w:type="gramEnd"/>
-          </w:p>
-          <w:p>
-            <w:r>
-              <w:t>Parent and Child – Parent</w:t>
-            </w:r>
-          </w:p>
-          <w:p>
-            <w:r>
-              <w:t>Parent and Child - Child</w:t>
-            </w:r>
           </w:p>
         </w:tc>
       </w:tr>
     </w:tbl>
-    <w:p>
-      <w:pPr>
-        <w:rPr>
-          <w:sz w:val="32"/>
-          <w:szCs w:val="32"/>
-        </w:rPr>
-      </w:pPr>
-    </w:p>
-    <w:p>
-      <w:pPr>
-        <w:rPr>
-          <w:sz w:val="32"/>
-          <w:szCs w:val="32"/>
-        </w:rPr>
-      </w:pPr>
-    </w:p>
-    <w:p>
-      <w:pPr>
-        <w:rPr>
-          <w:sz w:val="32"/>
-          <w:szCs w:val="32"/>
-        </w:rPr>
-      </w:pPr>
-    </w:p>
     <w:p>
       <w:pPr>
         <w:rPr>
@@ -2113,6 +1962,26 @@
 </file>
 
 <file path=customXml/item1.xml><?xml version="1.0" encoding="utf-8"?>
+<?mso-contentType ?>
+<FormTemplates xmlns="http://schemas.microsoft.com/sharepoint/v3/contenttype/forms">
+  <Display>DocumentLibraryForm</Display>
+  <Edit>DocumentLibraryForm</Edit>
+  <New>DocumentLibraryForm</New>
+</FormTemplates>
+</file>
+
+<file path=customXml/item2.xml><?xml version="1.0" encoding="utf-8"?>
+<p:properties xmlns:p="http://schemas.microsoft.com/office/2006/metadata/properties" xmlns:xsi="http://www.w3.org/2001/XMLSchema-instance" xmlns:pc="http://schemas.microsoft.com/office/infopath/2007/PartnerControls">
+  <documentManagement>
+    <lcf76f155ced4ddcb4097134ff3c332f xmlns="d981d730-cbae-4e7b-b1b9-e58d358f9b74">
+      <Terms xmlns="http://schemas.microsoft.com/office/infopath/2007/PartnerControls"/>
+    </lcf76f155ced4ddcb4097134ff3c332f>
+    <TaxCatchAll xmlns="a177af71-9a5e-4e96-8998-41ddd644bae2" xsi:nil="true"/>
+  </documentManagement>
+</p:properties>
+</file>
+
+<file path=customXml/item3.xml><?xml version="1.0" encoding="utf-8"?>
 <ct:contentTypeSchema xmlns:ct="http://schemas.microsoft.com/office/2006/metadata/contentType" xmlns:ma="http://schemas.microsoft.com/office/2006/metadata/properties/metaAttributes" ct:_="" ma:_="" ma:contentTypeName="Document" ma:contentTypeID="0x0101004E0942F068A51341811C6031642F533D" ma:contentTypeVersion="21" ma:contentTypeDescription="Create a new document." ma:contentTypeScope="" ma:versionID="97405257797b181224210849ebb5ef04">
   <xsd:schema xmlns:xsd="http://www.w3.org/2001/XMLSchema" xmlns:xs="http://www.w3.org/2001/XMLSchema" xmlns:p="http://schemas.microsoft.com/office/2006/metadata/properties" xmlns:ns2="a177af71-9a5e-4e96-8998-41ddd644bae2" xmlns:ns3="d981d730-cbae-4e7b-b1b9-e58d358f9b74" targetNamespace="http://schemas.microsoft.com/office/2006/metadata/properties" ma:root="true" ma:fieldsID="d216ad4ef2bbf45ce58500147720a641" ns2:_="" ns3:_="">
     <xsd:import namespace="a177af71-9a5e-4e96-8998-41ddd644bae2"/>
@@ -2353,27 +2222,26 @@
 </ct:contentTypeSchema>
 </file>
 
-<file path=customXml/item2.xml><?xml version="1.0" encoding="utf-8"?>
-<p:properties xmlns:p="http://schemas.microsoft.com/office/2006/metadata/properties" xmlns:xsi="http://www.w3.org/2001/XMLSchema-instance" xmlns:pc="http://schemas.microsoft.com/office/infopath/2007/PartnerControls">
-  <documentManagement>
-    <lcf76f155ced4ddcb4097134ff3c332f xmlns="d981d730-cbae-4e7b-b1b9-e58d358f9b74">
-      <Terms xmlns="http://schemas.microsoft.com/office/infopath/2007/PartnerControls"/>
-    </lcf76f155ced4ddcb4097134ff3c332f>
-    <TaxCatchAll xmlns="a177af71-9a5e-4e96-8998-41ddd644bae2" xsi:nil="true"/>
-  </documentManagement>
-</p:properties>
+<file path=customXml/itemProps1.xml><?xml version="1.0" encoding="utf-8"?>
+<ds:datastoreItem xmlns:ds="http://schemas.openxmlformats.org/officeDocument/2006/customXml" ds:itemID="{37A56531-0DFE-4B5D-A9DB-713266299EAF}">
+  <ds:schemaRefs>
+    <ds:schemaRef ds:uri="http://schemas.microsoft.com/sharepoint/v3/contenttype/forms"/>
+  </ds:schemaRefs>
+</ds:datastoreItem>
 </file>
 
-<file path=customXml/item3.xml><?xml version="1.0" encoding="utf-8"?>
-<?mso-contentType ?>
-<FormTemplates xmlns="http://schemas.microsoft.com/sharepoint/v3/contenttype/forms">
-  <Display>DocumentLibraryForm</Display>
-  <Edit>DocumentLibraryForm</Edit>
-  <New>DocumentLibraryForm</New>
-</FormTemplates>
+<file path=customXml/itemProps2.xml><?xml version="1.0" encoding="utf-8"?>
+<ds:datastoreItem xmlns:ds="http://schemas.openxmlformats.org/officeDocument/2006/customXml" ds:itemID="{6568D658-714E-4BEA-8321-46F1FAF041F7}">
+  <ds:schemaRefs>
+    <ds:schemaRef ds:uri="http://schemas.microsoft.com/office/2006/metadata/properties"/>
+    <ds:schemaRef ds:uri="http://schemas.microsoft.com/office/infopath/2007/PartnerControls"/>
+    <ds:schemaRef ds:uri="d981d730-cbae-4e7b-b1b9-e58d358f9b74"/>
+    <ds:schemaRef ds:uri="a177af71-9a5e-4e96-8998-41ddd644bae2"/>
+  </ds:schemaRefs>
+</ds:datastoreItem>
 </file>
 
-<file path=customXml/itemProps1.xml><?xml version="1.0" encoding="utf-8"?>
+<file path=customXml/itemProps3.xml><?xml version="1.0" encoding="utf-8"?>
 <ds:datastoreItem xmlns:ds="http://schemas.openxmlformats.org/officeDocument/2006/customXml" ds:itemID="{A713B942-5F1D-4062-862E-8E86D2BF3837}">
   <ds:schemaRefs>
     <ds:schemaRef ds:uri="http://schemas.microsoft.com/office/2006/metadata/contentType"/>
@@ -2390,23 +2258,4 @@
     <ds:schemaRef ds:uri="http://schemas.microsoft.com/internal/obd"/>
   </ds:schemaRefs>
 </ds:datastoreItem>
-</file>
-
-<file path=customXml/itemProps2.xml><?xml version="1.0" encoding="utf-8"?>
-<ds:datastoreItem xmlns:ds="http://schemas.openxmlformats.org/officeDocument/2006/customXml" ds:itemID="{6568D658-714E-4BEA-8321-46F1FAF041F7}">
-  <ds:schemaRefs>
-    <ds:schemaRef ds:uri="http://schemas.microsoft.com/office/2006/metadata/properties"/>
-    <ds:schemaRef ds:uri="http://schemas.microsoft.com/office/infopath/2007/PartnerControls"/>
-    <ds:schemaRef ds:uri="d981d730-cbae-4e7b-b1b9-e58d358f9b74"/>
-    <ds:schemaRef ds:uri="a177af71-9a5e-4e96-8998-41ddd644bae2"/>
-  </ds:schemaRefs>
-</ds:datastoreItem>
-</file>
-
-<file path=customXml/itemProps3.xml><?xml version="1.0" encoding="utf-8"?>
-<ds:datastoreItem xmlns:ds="http://schemas.openxmlformats.org/officeDocument/2006/customXml" ds:itemID="{37A56531-0DFE-4B5D-A9DB-713266299EAF}">
-  <ds:schemaRefs>
-    <ds:schemaRef ds:uri="http://schemas.microsoft.com/sharepoint/v3/contenttype/forms"/>
-  </ds:schemaRefs>
-</ds:datastoreItem>
 </file>
</xml_diff>